<commit_message>
Remove pagina em branco apos Documentos disponibilizados (parag. vazios residuais)
</commit_message>
<xml_diff>
--- a/templates/template_proposta.docx
+++ b/templates/template_proposta.docx
@@ -2989,343 +2989,6 @@
         </w:rPr>
         <w:t>{{p imagens}}</w:t>
       </w:r>
-    </w:p>
-    <w:p>
-      <w:pPr>
-        <w:ind w:right="1704"/>
-        <w:jc w:val="both"/>
-      </w:pPr>
-    </w:p>
-    <w:p>
-      <w:pPr>
-        <w:ind w:right="1704"/>
-        <w:jc w:val="both"/>
-      </w:pPr>
-    </w:p>
-    <w:p>
-      <w:pPr>
-        <w:ind w:right="1704"/>
-        <w:jc w:val="both"/>
-      </w:pPr>
-    </w:p>
-    <w:p>
-      <w:pPr>
-        <w:ind w:right="1704"/>
-        <w:jc w:val="both"/>
-      </w:pPr>
-    </w:p>
-    <w:p>
-      <w:pPr>
-        <w:ind w:right="1704"/>
-        <w:jc w:val="both"/>
-      </w:pPr>
-    </w:p>
-    <w:p>
-      <w:pPr>
-        <w:ind w:right="1704"/>
-        <w:jc w:val="both"/>
-      </w:pPr>
-    </w:p>
-    <w:p>
-      <w:pPr>
-        <w:ind w:right="1704"/>
-        <w:jc w:val="both"/>
-      </w:pPr>
-    </w:p>
-    <w:p>
-      <w:pPr>
-        <w:ind w:right="1704"/>
-        <w:jc w:val="both"/>
-      </w:pPr>
-    </w:p>
-    <w:p>
-      <w:pPr>
-        <w:ind w:right="1704"/>
-        <w:jc w:val="both"/>
-      </w:pPr>
-    </w:p>
-    <w:p>
-      <w:pPr>
-        <w:ind w:right="1704"/>
-        <w:jc w:val="both"/>
-      </w:pPr>
-    </w:p>
-    <w:p>
-      <w:pPr>
-        <w:ind w:right="1704"/>
-        <w:jc w:val="both"/>
-      </w:pPr>
-    </w:p>
-    <w:p>
-      <w:pPr>
-        <w:ind w:right="1704"/>
-        <w:jc w:val="both"/>
-      </w:pPr>
-    </w:p>
-    <w:p>
-      <w:pPr>
-        <w:ind w:right="1704"/>
-        <w:jc w:val="both"/>
-      </w:pPr>
-      <w:r>
-        <w:br/>
-      </w:r>
-    </w:p>
-    <w:p>
-      <w:pPr>
-        <w:ind w:right="1704"/>
-        <w:jc w:val="both"/>
-      </w:pPr>
-    </w:p>
-    <w:p>
-      <w:pPr>
-        <w:ind w:right="1704"/>
-        <w:jc w:val="both"/>
-      </w:pPr>
-    </w:p>
-    <w:p>
-      <w:pPr>
-        <w:ind w:right="1704"/>
-        <w:jc w:val="both"/>
-      </w:pPr>
-    </w:p>
-    <w:p>
-      <w:pPr>
-        <w:ind w:right="1704"/>
-        <w:jc w:val="both"/>
-      </w:pPr>
-    </w:p>
-    <w:p>
-      <w:pPr>
-        <w:ind w:right="1704"/>
-        <w:jc w:val="both"/>
-      </w:pPr>
-    </w:p>
-    <w:p>
-      <w:pPr>
-        <w:ind w:right="1704"/>
-        <w:jc w:val="both"/>
-      </w:pPr>
-    </w:p>
-    <w:p>
-      <w:pPr>
-        <w:ind w:right="1704"/>
-        <w:jc w:val="both"/>
-      </w:pPr>
-    </w:p>
-    <w:p>
-      <w:pPr>
-        <w:ind w:right="1704"/>
-        <w:jc w:val="both"/>
-      </w:pPr>
-    </w:p>
-    <w:p>
-      <w:pPr>
-        <w:ind w:right="1704"/>
-        <w:jc w:val="both"/>
-      </w:pPr>
-    </w:p>
-    <w:p>
-      <w:pPr>
-        <w:ind w:right="1704"/>
-        <w:jc w:val="both"/>
-      </w:pPr>
-    </w:p>
-    <w:p>
-      <w:pPr>
-        <w:ind w:right="1704"/>
-        <w:jc w:val="both"/>
-      </w:pPr>
-    </w:p>
-    <w:p>
-      <w:pPr>
-        <w:ind w:right="1704"/>
-        <w:jc w:val="both"/>
-      </w:pPr>
-    </w:p>
-    <w:p>
-      <w:pPr>
-        <w:ind w:right="1704"/>
-        <w:jc w:val="both"/>
-      </w:pPr>
-    </w:p>
-    <w:p>
-      <w:pPr>
-        <w:ind w:right="1704"/>
-        <w:jc w:val="both"/>
-      </w:pPr>
-    </w:p>
-    <w:p>
-      <w:pPr>
-        <w:pBdr>
-          <w:top w:val="nil"/>
-          <w:left w:val="nil"/>
-          <w:bottom w:val="nil"/>
-          <w:right w:val="nil"/>
-          <w:between w:val="nil"/>
-        </w:pBdr>
-        <w:rPr>
-          <w:rFonts w:ascii="Arial Narrow" w:hAnsi="Arial Narrow"/>
-          <w:b/>
-          <w:color w:val="000000"/>
-          <w:sz w:val="20"/>
-          <w:szCs w:val="20"/>
-        </w:rPr>
-      </w:pPr>
-    </w:p>
-    <w:p>
-      <w:pPr>
-        <w:pBdr>
-          <w:top w:val="nil"/>
-          <w:left w:val="nil"/>
-          <w:bottom w:val="nil"/>
-          <w:right w:val="nil"/>
-          <w:between w:val="nil"/>
-        </w:pBdr>
-        <w:rPr>
-          <w:rFonts w:ascii="Arial Narrow" w:hAnsi="Arial Narrow"/>
-          <w:b/>
-          <w:color w:val="000000"/>
-          <w:sz w:val="20"/>
-          <w:szCs w:val="20"/>
-        </w:rPr>
-      </w:pPr>
-    </w:p>
-    <w:p>
-      <w:pPr>
-        <w:pBdr>
-          <w:top w:val="nil"/>
-          <w:left w:val="nil"/>
-          <w:bottom w:val="nil"/>
-          <w:right w:val="nil"/>
-          <w:between w:val="nil"/>
-        </w:pBdr>
-        <w:rPr>
-          <w:rFonts w:ascii="Arial Narrow" w:hAnsi="Arial Narrow"/>
-          <w:b/>
-          <w:color w:val="000000"/>
-          <w:sz w:val="20"/>
-          <w:szCs w:val="20"/>
-        </w:rPr>
-      </w:pPr>
-    </w:p>
-    <w:p>
-      <w:pPr>
-        <w:pBdr>
-          <w:top w:val="nil"/>
-          <w:left w:val="nil"/>
-          <w:bottom w:val="nil"/>
-          <w:right w:val="nil"/>
-          <w:between w:val="nil"/>
-        </w:pBdr>
-        <w:rPr>
-          <w:rFonts w:ascii="Arial Narrow" w:hAnsi="Arial Narrow"/>
-          <w:b/>
-          <w:color w:val="000000"/>
-          <w:sz w:val="20"/>
-          <w:szCs w:val="20"/>
-        </w:rPr>
-      </w:pPr>
-    </w:p>
-    <w:p>
-      <w:pPr>
-        <w:pBdr>
-          <w:top w:val="nil"/>
-          <w:left w:val="nil"/>
-          <w:bottom w:val="nil"/>
-          <w:right w:val="nil"/>
-          <w:between w:val="nil"/>
-        </w:pBdr>
-        <w:rPr>
-          <w:rFonts w:ascii="Arial Narrow" w:hAnsi="Arial Narrow"/>
-          <w:b/>
-          <w:color w:val="000000"/>
-          <w:sz w:val="20"/>
-          <w:szCs w:val="20"/>
-        </w:rPr>
-      </w:pPr>
-    </w:p>
-    <w:p>
-      <w:pPr>
-        <w:pBdr>
-          <w:top w:val="nil"/>
-          <w:left w:val="nil"/>
-          <w:bottom w:val="nil"/>
-          <w:right w:val="nil"/>
-          <w:between w:val="nil"/>
-        </w:pBdr>
-        <w:rPr>
-          <w:rFonts w:ascii="Arial Narrow" w:hAnsi="Arial Narrow"/>
-          <w:b/>
-          <w:color w:val="000000"/>
-          <w:sz w:val="20"/>
-          <w:szCs w:val="20"/>
-        </w:rPr>
-      </w:pPr>
-    </w:p>
-    <w:p>
-      <w:pPr>
-        <w:pBdr>
-          <w:top w:val="nil"/>
-          <w:left w:val="nil"/>
-          <w:bottom w:val="nil"/>
-          <w:right w:val="nil"/>
-          <w:between w:val="nil"/>
-        </w:pBdr>
-        <w:spacing w:before="214"/>
-        <w:ind w:left="709"/>
-        <w:rPr>
-          <w:rFonts w:ascii="Arial Narrow" w:hAnsi="Arial Narrow"/>
-          <w:b/>
-          <w:color w:val="000000"/>
-          <w:sz w:val="20"/>
-          <w:szCs w:val="20"/>
-        </w:rPr>
-      </w:pPr>
-    </w:p>
-    <w:p>
-      <w:pPr>
-        <w:pBdr>
-          <w:top w:val="nil"/>
-          <w:left w:val="nil"/>
-          <w:bottom w:val="nil"/>
-          <w:right w:val="nil"/>
-          <w:between w:val="nil"/>
-        </w:pBdr>
-        <w:spacing w:before="214"/>
-        <w:rPr>
-          <w:rFonts w:ascii="Arial Narrow" w:hAnsi="Arial Narrow"/>
-          <w:b/>
-          <w:color w:val="000000"/>
-          <w:sz w:val="20"/>
-          <w:szCs w:val="20"/>
-        </w:rPr>
-      </w:pPr>
-    </w:p>
-    <w:p>
-      <w:pPr>
-        <w:pBdr>
-          <w:top w:val="nil"/>
-          <w:left w:val="nil"/>
-          <w:bottom w:val="nil"/>
-          <w:right w:val="nil"/>
-          <w:between w:val="nil"/>
-        </w:pBdr>
-        <w:spacing w:before="214"/>
-        <w:rPr>
-          <w:rFonts w:ascii="Arial Narrow" w:hAnsi="Arial Narrow"/>
-          <w:b/>
-          <w:color w:val="000000"/>
-          <w:sz w:val="20"/>
-          <w:szCs w:val="20"/>
-        </w:rPr>
-        <w:sectPr>
-          <w:pgSz w:w="11910" w:h="16850"/>
-          <w:pgMar w:top="120" w:right="0" w:bottom="280" w:left="0" w:header="1417" w:footer="360" w:gutter="0"/>
-          <w:cols w:space="720"/>
-          <w:docGrid w:linePitch="299"/>
-        </w:sectPr>
-      </w:pPr>
     </w:p>
     <w:p>
       <w:pPr>

</xml_diff>

<commit_message>
Adiciona secao de Observacoes (estava faltando) e forca Escopo a comecar em pagina nova
</commit_message>
<xml_diff>
--- a/templates/template_proposta.docx
+++ b/templates/template_proposta.docx
@@ -2993,6 +2993,7 @@
     <w:p>
       <w:pPr>
         <w:pStyle w:val="Ttulo1"/>
+        <w:pageBreakBefore/>
         <w:ind w:left="1701"/>
       </w:pPr>
       <w:bookmarkStart w:id="4" w:name="_Toc190957974"/>
@@ -4546,6 +4547,19 @@
           <w:szCs w:val="24"/>
         </w:rPr>
       </w:pPr>
+    </w:p>
+    <w:p>
+      <w:r>
+        <w:rPr>
+          <w:b/>
+        </w:rPr>
+        <w:t>Observações - itens exclusos desta proposta:</w:t>
+      </w:r>
+    </w:p>
+    <w:p>
+      <w:r>
+        <w:t>{{ observacoes_exclusao }}</w:t>
+      </w:r>
     </w:p>
     <w:p>
       <w:pPr>

</xml_diff>

<commit_message>
Adiciona fluxo de Revisao de proposta existente (puxa dados/fotos/LPU antiga, gera codigo RVxx, seccao Revisao no documento)
</commit_message>
<xml_diff>
--- a/templates/template_proposta.docx
+++ b/templates/template_proposta.docx
@@ -4559,6 +4559,11 @@
     <w:p>
       <w:r>
         <w:t>{{ observacoes_exclusao }}</w:t>
+      </w:r>
+    </w:p>
+    <w:p>
+      <w:r>
+        <w:t>{{p secao_revisao}}</w:t>
       </w:r>
     </w:p>
     <w:p>

</xml_diff>

<commit_message>
Aplica recuo padrao do documento nos textos de Observacoes e da secao Revisao
</commit_message>
<xml_diff>
--- a/templates/template_proposta.docx
+++ b/templates/template_proposta.docx
@@ -4549,6 +4549,9 @@
       </w:pPr>
     </w:p>
     <w:p>
+      <w:pPr>
+        <w:ind w:left="851" w:firstLine="589"/>
+      </w:pPr>
       <w:r>
         <w:rPr>
           <w:b/>
@@ -4557,6 +4560,9 @@
       </w:r>
     </w:p>
     <w:p>
+      <w:pPr>
+        <w:ind w:left="851" w:firstLine="589"/>
+      </w:pPr>
       <w:r>
         <w:t>{{ observacoes_exclusao }}</w:t>
       </w:r>

</xml_diff>